<commit_message>
feat(maintenance): add planned maintenance button and update document translations
</commit_message>
<xml_diff>
--- a/docs/maintenance_daily_checklist.docx
+++ b/docs/maintenance_daily_checklist.docx
@@ -66,7 +66,7 @@
                 <w:lang w:eastAsia="en-US"/>
               </w:rPr>
               <w:drawing>
-                <wp:inline distT="0" distB="0" distL="0" distR="0" wp14:anchorId="72E81516" wp14:editId="09DE21AE">
+                <wp:inline distT="0" distB="0" distL="0" distR="0" wp14:anchorId="72E81516" wp14:editId="255CD0D6">
                   <wp:extent cx="941070" cy="354146"/>
                   <wp:effectExtent l="0" t="0" r="0" b="8255"/>
                   <wp:docPr id="6" name="Picture 6"/>
@@ -326,7 +326,16 @@
                 <w:bCs/>
                 <w:sz w:val="20"/>
               </w:rPr>
-              <w:t>Data-</w:t>
+              <w:t>Datum</w:t>
+            </w:r>
+            <w:r>
+              <w:rPr>
+                <w:rFonts w:ascii="Red Hat Display Light" w:hAnsi="Red Hat Display Light" w:cs="Red Hat Display Light"/>
+                <w:b w:val="0"/>
+                <w:bCs/>
+                <w:sz w:val="20"/>
+              </w:rPr>
+              <w:t>-</w:t>
             </w:r>
             <w:r>
               <w:rPr>
@@ -451,7 +460,21 @@
                 <w:rFonts w:ascii="Red Hat Display Medium" w:hAnsi="Red Hat Display Medium" w:cs="Red Hat Display Medium"/>
                 <w:sz w:val="22"/>
               </w:rPr>
-              <w:t xml:space="preserve">1. SHUTDOWN NECESSARIO? – MANDATORY SHUTDOWN? </w:t>
+              <w:t xml:space="preserve">1. </w:t>
+            </w:r>
+            <w:r>
+              <w:rPr>
+                <w:rFonts w:ascii="Red Hat Display Medium" w:hAnsi="Red Hat Display Medium" w:cs="Red Hat Display Medium"/>
+                <w:sz w:val="22"/>
+              </w:rPr>
+              <w:t>ABSCHALTUNG ERFORDERLICH??</w:t>
+            </w:r>
+            <w:r>
+              <w:rPr>
+                <w:rFonts w:ascii="Red Hat Display Medium" w:hAnsi="Red Hat Display Medium" w:cs="Red Hat Display Medium"/>
+                <w:sz w:val="22"/>
+              </w:rPr>
+              <w:t xml:space="preserve">– MANDATORY SHUTDOWN? </w:t>
             </w:r>
             <w:r>
               <w:rPr>
@@ -476,7 +499,7 @@
                 <w:bCs/>
                 <w:sz w:val="22"/>
               </w:rPr>
-              <w:t xml:space="preserve">                </w:t>
+              <w:t xml:space="preserve">  </w:t>
             </w:r>
             <w:r>
               <w:rPr>
@@ -637,24 +660,28 @@
               <w:rPr>
                 <w:rFonts w:ascii="Red Hat Display Medium" w:hAnsi="Red Hat Display Medium" w:cs="Red Hat Display Medium"/>
                 <w:sz w:val="22"/>
-                <w:lang w:val="it-IT"/>
-              </w:rPr>
-            </w:pPr>
-            <w:r>
-              <w:rPr>
-                <w:rFonts w:ascii="Red Hat Display Medium" w:hAnsi="Red Hat Display Medium" w:cs="Red Hat Display Medium"/>
-                <w:sz w:val="22"/>
-                <w:lang w:val="it-IT"/>
-              </w:rPr>
-              <w:t xml:space="preserve">PROCEDURA LOTO APPLICABILE? - LOTO PROCEDURE APPLIED? </w:t>
-            </w:r>
-            <w:r>
-              <w:rPr>
-                <w:rFonts w:ascii="Red Hat Display Medium" w:hAnsi="Red Hat Display Medium" w:cs="Red Hat Display Medium"/>
-                <w:b w:val="0"/>
-                <w:bCs/>
-                <w:sz w:val="22"/>
-                <w:lang w:val="it-IT"/>
+              </w:rPr>
+            </w:pPr>
+            <w:r>
+              <w:rPr>
+                <w:rFonts w:ascii="Red Hat Display Medium" w:hAnsi="Red Hat Display Medium" w:cs="Red Hat Display Medium"/>
+                <w:sz w:val="22"/>
+              </w:rPr>
+              <w:t xml:space="preserve">LOTO-VERFAHREN ERFORDERLICH? </w:t>
+            </w:r>
+            <w:r>
+              <w:rPr>
+                <w:rFonts w:ascii="Red Hat Display Medium" w:hAnsi="Red Hat Display Medium" w:cs="Red Hat Display Medium"/>
+                <w:sz w:val="22"/>
+              </w:rPr>
+              <w:t xml:space="preserve">- LOTO PROCEDURE APPLIED? </w:t>
+            </w:r>
+            <w:r>
+              <w:rPr>
+                <w:rFonts w:ascii="Red Hat Display Medium" w:hAnsi="Red Hat Display Medium" w:cs="Red Hat Display Medium"/>
+                <w:b w:val="0"/>
+                <w:bCs/>
+                <w:sz w:val="22"/>
               </w:rPr>
               <w:t>:</w:t>
             </w:r>
@@ -663,18 +690,8 @@
                 <w:b w:val="0"/>
                 <w:bCs/>
                 <w:sz w:val="22"/>
-                <w:lang w:val="it-IT"/>
-              </w:rPr>
-              <w:t xml:space="preserve">               </w:t>
-            </w:r>
-            <w:r>
-              <w:rPr>
-                <w:b w:val="0"/>
-                <w:bCs/>
-                <w:sz w:val="22"/>
-                <w:lang w:val="it-IT"/>
-              </w:rPr>
-              <w:t xml:space="preserve">  </w:t>
+              </w:rPr>
+              <w:t xml:space="preserve">            </w:t>
             </w:r>
             <w:r>
               <w:rPr>
@@ -701,7 +718,6 @@
                 <w:b w:val="0"/>
                 <w:bCs/>
                 <w:sz w:val="22"/>
-                <w:lang w:val="it-IT"/>
               </w:rPr>
               <w:instrText xml:space="preserve"> FORMCHECKBOX </w:instrText>
             </w:r>
@@ -737,7 +753,6 @@
                 <w:b w:val="0"/>
                 <w:bCs/>
                 <w:sz w:val="22"/>
-                <w:lang w:val="it-IT"/>
               </w:rPr>
               <w:t xml:space="preserve"> YES     </w:t>
             </w:r>
@@ -766,7 +781,6 @@
                 <w:b w:val="0"/>
                 <w:bCs/>
                 <w:sz w:val="22"/>
-                <w:lang w:val="it-IT"/>
               </w:rPr>
               <w:instrText xml:space="preserve"> FORMCHECKBOX </w:instrText>
             </w:r>
@@ -802,26 +816,14 @@
                 <w:b w:val="0"/>
                 <w:bCs/>
                 <w:sz w:val="22"/>
-                <w:lang w:val="it-IT"/>
-              </w:rPr>
-              <w:t xml:space="preserve"> N</w:t>
-            </w:r>
-            <w:r>
-              <w:rPr>
-                <w:rFonts w:ascii="Red Hat Display Medium" w:hAnsi="Red Hat Display Medium" w:cs="Red Hat Display Medium"/>
-                <w:b w:val="0"/>
-                <w:bCs/>
-                <w:sz w:val="22"/>
-                <w:lang w:val="it-IT"/>
-              </w:rPr>
-              <w:t>/A</w:t>
-            </w:r>
-            <w:r>
-              <w:rPr>
-                <w:b w:val="0"/>
-                <w:bCs/>
-                <w:sz w:val="22"/>
-                <w:lang w:val="it-IT"/>
+              </w:rPr>
+              <w:t xml:space="preserve"> N/A</w:t>
+            </w:r>
+            <w:r>
+              <w:rPr>
+                <w:b w:val="0"/>
+                <w:bCs/>
+                <w:sz w:val="22"/>
               </w:rPr>
               <w:t xml:space="preserve">                                          </w:t>
             </w:r>
@@ -863,7 +865,7 @@
                 <w:sz w:val="22"/>
                 <w:lang w:val="it-IT"/>
               </w:rPr>
-              <w:t>Ora</w:t>
+              <w:t>Zeit</w:t>
             </w:r>
             <w:r>
               <w:rPr>
@@ -1133,7 +1135,21 @@
                 <w:rFonts w:ascii="Red Hat Display Medium" w:hAnsi="Red Hat Display Medium" w:cs="Red Hat Display Medium"/>
                 <w:sz w:val="22"/>
               </w:rPr>
-              <w:t xml:space="preserve">. TIPO DI INTERVENTO – MAINTENANCE </w:t>
+              <w:t xml:space="preserve">. </w:t>
+            </w:r>
+            <w:r>
+              <w:rPr>
+                <w:rFonts w:ascii="Red Hat Display Medium" w:hAnsi="Red Hat Display Medium" w:cs="Red Hat Display Medium"/>
+                <w:sz w:val="22"/>
+              </w:rPr>
+              <w:t>INSTANDHALTUNGSART</w:t>
+            </w:r>
+            <w:r>
+              <w:rPr>
+                <w:rFonts w:ascii="Red Hat Display Medium" w:hAnsi="Red Hat Display Medium" w:cs="Red Hat Display Medium"/>
+                <w:sz w:val="22"/>
+              </w:rPr>
+              <w:t xml:space="preserve">– MAINTENANCE </w:t>
             </w:r>
           </w:p>
         </w:tc>
@@ -1246,7 +1262,16 @@
                 <w:bCs/>
                 <w:sz w:val="22"/>
               </w:rPr>
-              <w:t xml:space="preserve"> PMT1</w:t>
+              <w:t xml:space="preserve"> </w:t>
+            </w:r>
+            <w:r>
+              <w:rPr>
+                <w:rFonts w:ascii="Red Hat Display Medium" w:hAnsi="Red Hat Display Medium" w:cs="Red Hat Display Medium"/>
+                <w:b w:val="0"/>
+                <w:bCs/>
+                <w:sz w:val="22"/>
+              </w:rPr>
+              <w:t>Device 1</w:t>
             </w:r>
             <w:r>
               <w:rPr>
@@ -1317,7 +1342,16 @@
                 <w:bCs/>
                 <w:sz w:val="22"/>
               </w:rPr>
-              <w:t xml:space="preserve"> PMT+</w:t>
+              <w:t xml:space="preserve"> </w:t>
+            </w:r>
+            <w:r>
+              <w:rPr>
+                <w:rFonts w:ascii="Red Hat Display Medium" w:hAnsi="Red Hat Display Medium" w:cs="Red Hat Display Medium"/>
+                <w:b w:val="0"/>
+                <w:bCs/>
+                <w:sz w:val="22"/>
+              </w:rPr>
+              <w:t>Device 2</w:t>
             </w:r>
             <w:r>
               <w:rPr>
@@ -1376,7 +1410,17 @@
                 <w:sz w:val="20"/>
                 <w:lang w:val="it-IT"/>
               </w:rPr>
-              <w:t xml:space="preserve">Descrizione interventi </w:t>
+              <w:t>Tätigkeitsbeschreibung</w:t>
+            </w:r>
+            <w:r>
+              <w:rPr>
+                <w:rFonts w:ascii="Red Hat Display Medium" w:hAnsi="Red Hat Display Medium" w:cs="Red Hat Display Medium"/>
+                <w:b w:val="0"/>
+                <w:bCs/>
+                <w:sz w:val="20"/>
+                <w:lang w:val="it-IT"/>
+              </w:rPr>
+              <w:t xml:space="preserve"> </w:t>
             </w:r>
             <w:r>
               <w:rPr>
@@ -1431,7 +1475,7 @@
                 <w:sz w:val="20"/>
                 <w:lang w:val="it-IT"/>
               </w:rPr>
-              <w:t>Tempo Stimato</w:t>
+              <w:t xml:space="preserve">Geschätzte Dauer </w:t>
             </w:r>
             <w:r>
               <w:rPr>
@@ -1439,7 +1483,7 @@
                 <w:sz w:val="20"/>
                 <w:lang w:val="it-IT"/>
               </w:rPr>
-              <w:t xml:space="preserve"> – </w:t>
+              <w:t xml:space="preserve">– </w:t>
             </w:r>
             <w:r>
               <w:rPr>
@@ -1931,7 +1975,7 @@
                 <w:sz w:val="22"/>
                 <w:u w:val="single"/>
               </w:rPr>
-              <w:t>Note</w:t>
+              <w:t>Bemerkungen</w:t>
             </w:r>
             <w:r>
               <w:rPr>
@@ -2167,7 +2211,31 @@
                 <w:sz w:val="22"/>
                 <w:lang w:val="it-IT"/>
               </w:rPr>
-              <w:t>. RIAMMISSIONE IN SERVIZIO – RE ENTRY INTO SERVICE</w:t>
+              <w:t xml:space="preserve">. </w:t>
+            </w:r>
+            <w:r>
+              <w:rPr>
+                <w:rFonts w:ascii="Red Hat Display Medium" w:hAnsi="Red Hat Display Medium" w:cs="Red Hat Display Medium"/>
+                <w:sz w:val="22"/>
+                <w:lang w:val="it-IT"/>
+              </w:rPr>
+              <w:t>WIEDERINBETRIEBNAHME</w:t>
+            </w:r>
+            <w:r>
+              <w:rPr>
+                <w:rFonts w:ascii="Red Hat Display Medium" w:hAnsi="Red Hat Display Medium" w:cs="Red Hat Display Medium"/>
+                <w:sz w:val="22"/>
+                <w:lang w:val="it-IT"/>
+              </w:rPr>
+              <w:t xml:space="preserve"> </w:t>
+            </w:r>
+            <w:r>
+              <w:rPr>
+                <w:rFonts w:ascii="Red Hat Display Medium" w:hAnsi="Red Hat Display Medium" w:cs="Red Hat Display Medium"/>
+                <w:sz w:val="22"/>
+                <w:lang w:val="it-IT"/>
+              </w:rPr>
+              <w:t>– RE ENTRY INTO SERVICE</w:t>
             </w:r>
           </w:p>
         </w:tc>

</xml_diff>